<commit_message>
Easier sharing, practice agents, and the kit up to date
- The share form is the only GitHub step; practice agents go to practice/
- Test agents and issues from the setup checks cleared
- Kit synced from Community-Access/glow: new step cards 0 and 5, the ready
  check points to the practice share, examples describe the collection
- .gitattributes keeps line endings LF; .gitignore keeps caches out

Co-Authored-By: Claude Opus 5.5 <noreply@anthropic.com>
</commit_message>
<xml_diff>
--- a/kit/step-cards/0-before-the-day.docx
+++ b/kit/step-cards/0-before-the-day.docx
@@ -12,7 +12,7 @@
     </w:p>
     <w:p>
       <w:r>
-        <w:t>About 20 minutes, any time before 16 November.</w:t>
+        <w:t>About 25 minutes, any time before 16 November. Everything starts at letitglow.app/ahg.</w:t>
       </w:r>
     </w:p>
     <w:p>
@@ -25,7 +25,7 @@
     </w:p>
     <w:p>
       <w:r>
-        <w:t>A laptop that is ready for the whole workshop, and a message from Copilot saying so.</w:t>
+        <w:t>A laptop that is ready for the whole workshop, a message from Copilot saying so, and your practice agent already shared, so sharing on the day is the second time, not the first.</w:t>
       </w:r>
     </w:p>
     <w:p>
@@ -41,7 +41,7 @@
         <w:pStyle w:val="ListNumber"/>
       </w:pPr>
       <w:r>
-        <w:t>Make a free GitHub account at github.com. Use your work email if your institution allows it.</w:t>
+        <w:t>Make a free GitHub account at github.com. Use your work email if your institution allows it. If GitHub asks you to set up two-factor sign-in, choose the option that works best with your screen reader or phone; GitHub Mobile and an authenticator app both work.</w:t>
       </w:r>
     </w:p>
     <w:p>
@@ -73,7 +73,7 @@
         <w:pStyle w:val="ListNumber"/>
       </w:pPr>
       <w:r>
-        <w:t>Import the AHG 2026 profile from the link in your setup email. VS Code asks whether to import it; say yes. It installs everything else and makes the text larger.</w:t>
+        <w:t>Import the AHG 2026 profile: open the Command Palette with Control+Shift+P on Windows or Command+Shift+P on a Mac, type Profiles: Import Profile, and paste the profile address from letitglow.app/ahg. VS Code asks whether to import it; say yes. It installs everything else and makes the text larger.</w:t>
       </w:r>
     </w:p>
     <w:p>
@@ -81,7 +81,7 @@
         <w:pStyle w:val="ListNumber"/>
       </w:pPr>
       <w:r>
-        <w:t>Download the agent kit, unzip it, and open the folder in VS Code: File, then Open Folder. If VS Code asks whether you trust the folder, say yes; it is the workshop kit.</w:t>
+        <w:t>Download the agent kit from letitglow.app/ahg, unzip it, and open the folder in VS Code: File, then Open Folder. If VS Code asks whether you trust the folder, say yes; it is the workshop kit.</w:t>
       </w:r>
     </w:p>
     <w:p>
@@ -94,6 +94,14 @@
     </w:p>
     <w:p>
       <w:pPr>
+        <w:pStyle w:val="ListNumber"/>
+      </w:pPr>
+      <w:r>
+        <w:t>Share your practice agent. In your browser, open letitglow.app/ahg/share, choose "My practice agent", choose the file my-agent/SKILL.md from the kit, and press Open the share form on GitHub. On GitHub, tick the privacy box at the end of the form and press Submit new issue.</w:t>
+      </w:r>
+    </w:p>
+    <w:p>
+      <w:pPr>
         <w:pStyle w:val="Heading2"/>
       </w:pPr>
       <w:r>
@@ -102,7 +110,7 @@
     </w:p>
     <w:p>
       <w:r>
-        <w:t>Copilot ends with: You are ready for 16 November.</w:t>
+        <w:t>Copilot ends the ready check with: You are ready for 16 November. And on GitHub, within about a minute, a reply begins: Well done.</w:t>
       </w:r>
     </w:p>
     <w:p>
@@ -115,7 +123,7 @@
     </w:p>
     <w:p>
       <w:r>
-        <w:t>Write to support@community-access.org before the day, or come to the setup table outside the room from 10:00 on the day. Locked-down laptop? Write to us; nobody is left out.</w:t>
+        <w:t>Write to support@community-access.org before the day, or come to the setup table outside the room from 10:00 on the day. Locked-down laptop, or GitHub blocked at work? Write to us; nobody is left out.</w:t>
       </w:r>
     </w:p>
     <w:p>
@@ -128,7 +136,7 @@
     </w:p>
     <w:p>
       <w:r>
-        <w:t>You are set up. That was the hardest part of the day, and it is done.</w:t>
+        <w:t>You are set up, and you have already shared an agent once. The hardest part of the day is done.</w:t>
       </w:r>
     </w:p>
     <w:sectPr>

</xml_diff>

<commit_message>
Kit synced: three paths into the day
The browser path texts in kit/any-assistant/, the six commands as agent
skills in kit/.github/skills/ (prompt files run only in Local chat sessions
since VS Code 1.143), step cards with browser and VS Code steps, and the
share page's practice template and download buttons. From GLOW #140.

Co-Authored-By: Claude Opus 5.5 <noreply@anthropic.com>
</commit_message>
<xml_diff>
--- a/kit/step-cards/0-before-the-day.docx
+++ b/kit/step-cards/0-before-the-day.docx
@@ -12,7 +12,7 @@
     </w:p>
     <w:p>
       <w:r>
-        <w:t>About 25 minutes, any time before 16 November. Everything starts at letitglow.app/ahg.</w:t>
+        <w:t>About 10 to 25 minutes, any time before 16 November, depending on your path. Everything starts at letitglow.app/ahg.</w:t>
       </w:r>
     </w:p>
     <w:p>
@@ -25,7 +25,44 @@
     </w:p>
     <w:p>
       <w:r>
-        <w:t>A laptop that is ready for the whole workshop, a message from Copilot saying so, and your practice agent already shared, so sharing on the day is the second time, not the first.</w:t>
+        <w:t>A laptop that is ready for the whole workshop, a message from your AI assistant saying so, and your practice agent already shared, so sharing on the day is the second time, not the first.</w:t>
+      </w:r>
+    </w:p>
+    <w:p>
+      <w:pPr>
+        <w:pStyle w:val="Heading2"/>
+      </w:pPr>
+      <w:r>
+        <w:t>Choose your path</w:t>
+      </w:r>
+    </w:p>
+    <w:p>
+      <w:r>
+        <w:t>The day is the same on every path. Not sure? Take the browser path. letitglow.app/ahg/paths compares them.</w:t>
+      </w:r>
+    </w:p>
+    <w:p>
+      <w:pPr>
+        <w:pStyle w:val="ListBullet"/>
+      </w:pPr>
+      <w:r>
+        <w:t>The browser path: nothing to install. ChatGPT, Copilot on github.com, Claude, Gemini or your campus assistant, in any browser.</w:t>
+      </w:r>
+    </w:p>
+    <w:p>
+      <w:pPr>
+        <w:pStyle w:val="ListBullet"/>
+      </w:pPr>
+      <w:r>
+        <w:t>VS Code on your computer: install VS Code and type one Copilot command per block.</w:t>
+      </w:r>
+    </w:p>
+    <w:p>
+      <w:pPr>
+        <w:pStyle w:val="ListBullet"/>
+      </w:pPr>
+      <w:r>
+        <w:t>VS Code for the Web: the same VS Code and Copilot at vscode.dev, in Chrome or Edge, with nothing to install.</w:t>
       </w:r>
     </w:p>
     <w:p>
@@ -38,66 +75,262 @@
     </w:p>
     <w:p>
       <w:pPr>
-        <w:pStyle w:val="ListNumber"/>
+        <w:pStyle w:val="Heading3"/>
       </w:pPr>
       <w:r>
-        <w:t>Make a free GitHub account at github.com. Use your work email if your institution allows it. If GitHub asks you to set up two-factor sign-in, choose the option that works best with your screen reader or phone; GitHub Mobile and an authenticator app both work.</w:t>
+        <w:t>Everyone</w:t>
       </w:r>
     </w:p>
     <w:p>
       <w:pPr>
         <w:pStyle w:val="ListNumber"/>
+        <w:numPr>
+          <w:ilvl w:val="0"/>
+          <w:numId w:val="10"/>
+        </w:numPr>
       </w:pPr>
       <w:r>
-        <w:t>Turn on Copilot Free: on github.com, open Settings, then Copilot, and choose the free plan.</w:t>
+        <w:t>Make a free GitHub account at github.com, if you do not have one. Use your work email if your institution allows it. If GitHub asks you to set up two-factor sign-in, choose the option that works best with your screen reader or phone; GitHub Mobile and an authenticator app both work.</w:t>
+      </w:r>
+    </w:p>
+    <w:p>
+      <w:pPr>
+        <w:pStyle w:val="Heading3"/>
+      </w:pPr>
+      <w:r>
+        <w:t>In a browser</w:t>
       </w:r>
     </w:p>
     <w:p>
       <w:pPr>
         <w:pStyle w:val="ListNumber"/>
+        <w:numPr>
+          <w:ilvl w:val="0"/>
+          <w:numId w:val="11"/>
+        </w:numPr>
       </w:pPr>
       <w:r>
-        <w:t>Install VS Code from code.visualstudio.com. On Windows it installs without administrator rights.</w:t>
+        <w:t>Open your assistant in a new tab and sign in: chatgpt.com, github.com/copilot, claude.ai, gemini.google.com, or m365copilot.com with your work account. Sign in even if the assistant lets you start without it: ChatGPT stops after a message or two without an account.</w:t>
       </w:r>
     </w:p>
     <w:p>
       <w:pPr>
         <w:pStyle w:val="ListNumber"/>
+        <w:numPr>
+          <w:ilvl w:val="0"/>
+          <w:numId w:val="11"/>
+        </w:numPr>
       </w:pPr>
       <w:r>
-        <w:t>Open VS Code, and sign in to GitHub when it asks, or from the Accounts button.</w:t>
+        <w:t>Optional, and a good habit: turn off training. In ChatGPT, open your profile menu, then Settings, then Data controls, and turn off "Improve the model for everyone". letitglow.app/ahg/paths has the steps for the others.</w:t>
       </w:r>
     </w:p>
     <w:p>
       <w:pPr>
         <w:pStyle w:val="ListNumber"/>
+        <w:numPr>
+          <w:ilvl w:val="0"/>
+          <w:numId w:val="11"/>
+        </w:numPr>
       </w:pPr>
       <w:r>
-        <w:t>Import the AHG 2026 profile: open the Command Palette with Control+Shift+P on Windows or Command+Shift+P on a Mac, type Profiles: Import Profile, and paste the profile address from letitglow.app/ahg. VS Code asks whether to import it; say yes. It installs everything else and makes the text larger.</w:t>
+        <w:t>In another tab, open letitglow.app/ahg/assistant. Under "Block 1: the ready check", press the Copy button. A message under the button says it is copied.</w:t>
       </w:r>
     </w:p>
     <w:p>
       <w:pPr>
         <w:pStyle w:val="ListNumber"/>
+        <w:numPr>
+          <w:ilvl w:val="0"/>
+          <w:numId w:val="11"/>
+        </w:numPr>
       </w:pPr>
       <w:r>
-        <w:t>Download the agent kit from letitglow.app/ahg, unzip it, and open the folder in VS Code: File, then Open Folder. If VS Code asks whether you trust the folder, say yes; it is the workshop kit.</w:t>
+        <w:t>Switch to your assistant's tab with Control+Tab. Move to the message box, paste with Control+V on Windows or Command+V on a Mac, and press Enter.</w:t>
       </w:r>
     </w:p>
     <w:p>
       <w:pPr>
         <w:pStyle w:val="ListNumber"/>
+        <w:numPr>
+          <w:ilvl w:val="0"/>
+          <w:numId w:val="11"/>
+        </w:numPr>
       </w:pPr>
       <w:r>
-        <w:t>Open Copilot Chat: Control+Alt+I on Windows, or Command+Control+I on a Mac. Type /ready-check and press Enter.</w:t>
+        <w:t>Share your practice agent. Open letitglow.app/ahg/share, choose "My practice agent", press "Fill in the practice template", and press "Open the share form on GitHub". On GitHub, sign in if asked, tick the privacy box at the end of the form, and press "Submit new issue".</w:t>
+      </w:r>
+    </w:p>
+    <w:p>
+      <w:pPr>
+        <w:pStyle w:val="Heading3"/>
+      </w:pPr>
+      <w:r>
+        <w:t>In VS Code on your computer</w:t>
       </w:r>
     </w:p>
     <w:p>
       <w:pPr>
         <w:pStyle w:val="ListNumber"/>
+        <w:numPr>
+          <w:ilvl w:val="0"/>
+          <w:numId w:val="12"/>
+        </w:numPr>
       </w:pPr>
       <w:r>
-        <w:t>Share your practice agent. In your browser, open letitglow.app/ahg/share, choose "My practice agent", choose the file my-agent/SKILL.md from the kit, and press Open the share form on GitHub. On GitHub, tick the privacy box at the end of the form and press Submit new issue.</w:t>
+        <w:t>Install VS Code from code.visualstudio.com. On Windows it installs without administrator rights. You need version 1.143 or later.</w:t>
+      </w:r>
+    </w:p>
+    <w:p>
+      <w:pPr>
+        <w:pStyle w:val="ListNumber"/>
+        <w:numPr>
+          <w:ilvl w:val="0"/>
+          <w:numId w:val="12"/>
+        </w:numPr>
+      </w:pPr>
+      <w:r>
+        <w:t>Open VS Code. Open the Accounts menu, at the bottom of the bar on the left, and sign in with GitHub. Copilot Free turns on by itself for an account with no Copilot plan.</w:t>
+      </w:r>
+    </w:p>
+    <w:p>
+      <w:pPr>
+        <w:pStyle w:val="ListNumber"/>
+        <w:numPr>
+          <w:ilvl w:val="0"/>
+          <w:numId w:val="12"/>
+        </w:numPr>
+      </w:pPr>
+      <w:r>
+        <w:t>Import the AHG 2026 profile: open File, then Preferences, then Profiles. Open the menu on the New Profile button, choose Import Profile, paste the profile address from letitglow.app/ahg, and choose Create. It makes the text larger and turns on screen reader support.</w:t>
+      </w:r>
+    </w:p>
+    <w:p>
+      <w:pPr>
+        <w:pStyle w:val="ListNumber"/>
+        <w:numPr>
+          <w:ilvl w:val="0"/>
+          <w:numId w:val="12"/>
+        </w:numPr>
+      </w:pPr>
+      <w:r>
+        <w:t>Download the agent kit from letitglow.app/ahg and unzip it. Open the folder in VS Code: File, then Open Folder.</w:t>
+      </w:r>
+    </w:p>
+    <w:p>
+      <w:pPr>
+        <w:pStyle w:val="ListNumber"/>
+        <w:numPr>
+          <w:ilvl w:val="0"/>
+          <w:numId w:val="12"/>
+        </w:numPr>
+      </w:pPr>
+      <w:r>
+        <w:t>If a banner says Restricted Mode, choose Manage, then Trust. It is the workshop kit, and Copilot cannot work on its files until you trust it.</w:t>
+      </w:r>
+    </w:p>
+    <w:p>
+      <w:pPr>
+        <w:pStyle w:val="ListNumber"/>
+        <w:numPr>
+          <w:ilvl w:val="0"/>
+          <w:numId w:val="12"/>
+        </w:numPr>
+      </w:pPr>
+      <w:r>
+        <w:t>Open Copilot Chat: Control+Alt+I on Windows, or Control+Command+I on a Mac. Type /ready-check and press Enter.</w:t>
+      </w:r>
+    </w:p>
+    <w:p>
+      <w:pPr>
+        <w:pStyle w:val="ListNumber"/>
+        <w:numPr>
+          <w:ilvl w:val="0"/>
+          <w:numId w:val="12"/>
+        </w:numPr>
+      </w:pPr>
+      <w:r>
+        <w:t>Share your practice agent. Open letitglow.app/ahg/share in your browser, choose "My practice agent", choose the file my-agent/SKILL.md from the kit, and press "Open the share form on GitHub". On GitHub, tick the privacy box at the end of the form and press "Submit new issue".</w:t>
+      </w:r>
+    </w:p>
+    <w:p>
+      <w:pPr>
+        <w:pStyle w:val="Heading3"/>
+      </w:pPr>
+      <w:r>
+        <w:t>In VS Code for the Web</w:t>
+      </w:r>
+    </w:p>
+    <w:p>
+      <w:pPr>
+        <w:pStyle w:val="ListNumber"/>
+        <w:numPr>
+          <w:ilvl w:val="0"/>
+          <w:numId w:val="13"/>
+        </w:numPr>
+      </w:pPr>
+      <w:r>
+        <w:t>Download the agent kit from letitglow.app/ahg and unzip it. On Windows, open the zip and choose Extract all. On a Mac, open the zip.</w:t>
+      </w:r>
+    </w:p>
+    <w:p>
+      <w:pPr>
+        <w:pStyle w:val="ListNumber"/>
+        <w:numPr>
+          <w:ilvl w:val="0"/>
+          <w:numId w:val="13"/>
+        </w:numPr>
+      </w:pPr>
+      <w:r>
+        <w:t>In Chrome or Edge, go to vscode.dev. Safari and Firefox cannot open a folder from your laptop.</w:t>
+      </w:r>
+    </w:p>
+    <w:p>
+      <w:pPr>
+        <w:pStyle w:val="ListNumber"/>
+        <w:numPr>
+          <w:ilvl w:val="0"/>
+          <w:numId w:val="13"/>
+        </w:numPr>
+      </w:pPr>
+      <w:r>
+        <w:t>Choose Open Folder, and pick the ahg-2026-agent-kit folder. Your browser asks whether vscode.dev may see the files, and later whether it may save changes. Allow both.</w:t>
+      </w:r>
+    </w:p>
+    <w:p>
+      <w:pPr>
+        <w:pStyle w:val="ListNumber"/>
+        <w:numPr>
+          <w:ilvl w:val="0"/>
+          <w:numId w:val="13"/>
+        </w:numPr>
+      </w:pPr>
+      <w:r>
+        <w:t>Open the Accounts menu, at the bottom of the bar on the left, and sign in with GitHub.</w:t>
+      </w:r>
+    </w:p>
+    <w:p>
+      <w:pPr>
+        <w:pStyle w:val="ListNumber"/>
+        <w:numPr>
+          <w:ilvl w:val="0"/>
+          <w:numId w:val="13"/>
+        </w:numPr>
+      </w:pPr>
+      <w:r>
+        <w:t>Open Copilot Chat: Control+Alt+I on Windows, or Control+Command+I on a Mac. Type /ready-check and press Enter.</w:t>
+      </w:r>
+    </w:p>
+    <w:p>
+      <w:pPr>
+        <w:pStyle w:val="ListNumber"/>
+        <w:numPr>
+          <w:ilvl w:val="0"/>
+          <w:numId w:val="13"/>
+        </w:numPr>
+      </w:pPr>
+      <w:r>
+        <w:t>Share your practice agent, as in step 7 of the VS Code steps above.</w:t>
       </w:r>
     </w:p>
     <w:p>
@@ -110,7 +343,7 @@
     </w:p>
     <w:p>
       <w:r>
-        <w:t>Copilot ends the ready check with: You are ready for 16 November. And on GitHub, within about a minute, a reply begins: Well done.</w:t>
+        <w:t>Your assistant or Copilot ends the ready check with: You are ready for 16 November. And on GitHub, within about a minute, a reply begins: Well done.</w:t>
       </w:r>
     </w:p>
     <w:p>
@@ -123,7 +356,7 @@
     </w:p>
     <w:p>
       <w:r>
-        <w:t>Write to support@community-access.org before the day, or come to the setup table outside the room from 10:00 on the day. Locked-down laptop, or GitHub blocked at work? Write to us; nobody is left out.</w:t>
+        <w:t>Write to support@community-access.org before the day, or come to the setup table outside the room from 10:00 on the day. Locked-down laptop, or VS Code blocked at work? Take the browser path; it needs nothing installed. GitHub blocked at work? Write to us; nobody is left out.</w:t>
       </w:r>
     </w:p>
     <w:p>
@@ -371,6 +604,30 @@
   </w:num>
   <w:num w:numId="9">
     <w:abstractNumId w:val="0"/>
+  </w:num>
+  <w:num w:numId="10">
+    <w:abstractNumId w:val="7"/>
+    <w:lvlOverride w:ilvl="0">
+      <w:startOverride w:val="1"/>
+    </w:lvlOverride>
+  </w:num>
+  <w:num w:numId="11">
+    <w:abstractNumId w:val="7"/>
+    <w:lvlOverride w:ilvl="0">
+      <w:startOverride w:val="1"/>
+    </w:lvlOverride>
+  </w:num>
+  <w:num w:numId="12">
+    <w:abstractNumId w:val="7"/>
+    <w:lvlOverride w:ilvl="0">
+      <w:startOverride w:val="1"/>
+    </w:lvlOverride>
+  </w:num>
+  <w:num w:numId="13">
+    <w:abstractNumId w:val="7"/>
+    <w:lvlOverride w:ilvl="0">
+      <w:startOverride w:val="1"/>
+    </w:lvlOverride>
   </w:num>
 </w:numbering>
 </file>

</xml_diff>

<commit_message>
Sync the kit from GLOW 8b5ad6c: four formats, sources, outcomes, tutorial
Copied by scripts/sync_ahg_repo.py from GLOW main at 8b5ad6c (PR #159):
Accessibility Agents vendored at 2f4fe22; every participant document in
Markdown, HTML, ACB large print Word and a reading deck; claims checked
against primary sources on 29 October 2026 with a Sources list on each
page; the learning outcomes read back in /my-30-day-plan and step card 7;
a glossary; a screen reader section in the README; the agent-writing
tutorial, write-your-own-agent.md. agents/ and practice/ are untouched.

Co-Authored-By: Claude Opus 5.5 <noreply@anthropic.com>
</commit_message>
<xml_diff>
--- a/kit/step-cards/0-before-the-day.docx
+++ b/kit/step-cards/0-before-the-day.docx
@@ -12,6 +12,7 @@
     </w:p>
     <w:p>
       <w:r>
+        <w:rPr/>
         <w:t>About 10 to 25 minutes, any time before 16 November, depending on your path. Everything starts at letitglow.app/ahg.</w:t>
       </w:r>
     </w:p>
@@ -25,7 +26,22 @@
     </w:p>
     <w:p>
       <w:r>
+        <w:rPr/>
         <w:t>A laptop that is ready for the whole workshop, a message from your AI assistant saying so, and your practice agent already shared, so sharing on the day is the second time, not the first.</w:t>
+      </w:r>
+    </w:p>
+    <w:p>
+      <w:r>
+        <w:rPr/>
+        <w:t xml:space="preserve">New to words like agent, skill or Copilot Chat? Read </w:t>
+      </w:r>
+      <w:r>
+        <w:rPr/>
+        <w:t>glossary.md</w:t>
+      </w:r>
+      <w:r>
+        <w:rPr/>
+        <w:t xml:space="preserve"> in the kit, or at letitglow.app/ahg/kit, first. It is one page.</w:t>
       </w:r>
     </w:p>
     <w:p>
@@ -38,6 +54,7 @@
     </w:p>
     <w:p>
       <w:r>
+        <w:rPr/>
         <w:t>The day is the same on every path. Not sure? Take the browser path. letitglow.app/ahg/paths compares them.</w:t>
       </w:r>
     </w:p>
@@ -46,6 +63,7 @@
         <w:pStyle w:val="ListBullet"/>
       </w:pPr>
       <w:r>
+        <w:rPr/>
         <w:t>The browser path: nothing to install. ChatGPT, Copilot on github.com, Claude, Gemini or your campus assistant, in any browser.</w:t>
       </w:r>
     </w:p>
@@ -54,6 +72,7 @@
         <w:pStyle w:val="ListBullet"/>
       </w:pPr>
       <w:r>
+        <w:rPr/>
         <w:t>VS Code on your computer: install VS Code and type one Copilot command per block.</w:t>
       </w:r>
     </w:p>
@@ -62,6 +81,7 @@
         <w:pStyle w:val="ListBullet"/>
       </w:pPr>
       <w:r>
+        <w:rPr/>
         <w:t>VS Code for the Web: the same VS Code and Copilot at vscode.dev, in Chrome or Edge, with nothing to install.</w:t>
       </w:r>
     </w:p>
@@ -90,7 +110,21 @@
         </w:numPr>
       </w:pPr>
       <w:r>
+        <w:rPr/>
         <w:t>Make a free GitHub account at github.com, if you do not have one. Use your work email if your institution allows it. If GitHub asks you to set up two-factor sign-in, choose the option that works best with your screen reader or phone; GitHub Mobile and an authenticator app both work.</w:t>
+      </w:r>
+    </w:p>
+    <w:p>
+      <w:pPr>
+        <w:pStyle w:val="ListNumber"/>
+        <w:numPr>
+          <w:ilvl w:val="0"/>
+          <w:numId w:val="10"/>
+        </w:numPr>
+      </w:pPr>
+      <w:r>
+        <w:rPr/>
+        <w:t>Answer the five-minute survey at letitglow.app/ahg/survey: your name, email and GitHub username, your path, what your laptop and campus allow, and anything we should have ready for you.</w:t>
       </w:r>
     </w:p>
     <w:p>
@@ -110,6 +144,7 @@
         </w:numPr>
       </w:pPr>
       <w:r>
+        <w:rPr/>
         <w:t>Open your assistant in a new tab and sign in: chatgpt.com, github.com/copilot, claude.ai, gemini.google.com, or m365copilot.com with your work account. Sign in even if the assistant lets you start without it: ChatGPT stops after a message or two without an account.</w:t>
       </w:r>
     </w:p>
@@ -122,6 +157,7 @@
         </w:numPr>
       </w:pPr>
       <w:r>
+        <w:rPr/>
         <w:t>Optional, and a good habit: turn off training. In ChatGPT, open your profile menu, then Settings, then Data controls, and turn off "Improve the model for everyone". letitglow.app/ahg/paths has the steps for the others.</w:t>
       </w:r>
     </w:p>
@@ -134,6 +170,7 @@
         </w:numPr>
       </w:pPr>
       <w:r>
+        <w:rPr/>
         <w:t>In another tab, open letitglow.app/ahg/assistant. Under "Block 1: the ready check", press the Copy button. A message under the button says it is copied.</w:t>
       </w:r>
     </w:p>
@@ -146,6 +183,7 @@
         </w:numPr>
       </w:pPr>
       <w:r>
+        <w:rPr/>
         <w:t>Switch to your assistant's tab with Control+Tab. Move to the message box, paste with Control+V on Windows or Command+V on a Mac, and press Enter.</w:t>
       </w:r>
     </w:p>
@@ -158,7 +196,8 @@
         </w:numPr>
       </w:pPr>
       <w:r>
-        <w:t>Share your practice agent. Open letitglow.app/ahg/share, choose "My practice agent", press "Fill in the practice template", and press "Open the share form on GitHub". On GitHub, sign in if asked, tick the privacy box at the end of the form, and press "Submit new issue".</w:t>
+        <w:rPr/>
+        <w:t>Share your practice agent. Open letitglow.app/ahg/share, choose "My practice agent", press "Fill in the practice template", and press "Open the share form on GitHub". On GitHub, sign in if asked, select the privacy check box at the end of the form, and press "Submit new issue".</w:t>
       </w:r>
     </w:p>
     <w:p>
@@ -178,6 +217,7 @@
         </w:numPr>
       </w:pPr>
       <w:r>
+        <w:rPr/>
         <w:t>Install VS Code from code.visualstudio.com. On Windows it installs without administrator rights. You need version 1.143 or later.</w:t>
       </w:r>
     </w:p>
@@ -190,6 +230,7 @@
         </w:numPr>
       </w:pPr>
       <w:r>
+        <w:rPr/>
         <w:t>Open VS Code. Open the Accounts menu, at the bottom of the bar on the left, and sign in with GitHub. Copilot Free turns on by itself for an account with no Copilot plan.</w:t>
       </w:r>
     </w:p>
@@ -202,6 +243,7 @@
         </w:numPr>
       </w:pPr>
       <w:r>
+        <w:rPr/>
         <w:t>Import the AHG 2026 profile: open File, then Preferences, then Profiles. Open the menu on the New Profile button, choose Import Profile, paste the profile address from letitglow.app/ahg, and choose Create. It makes the text larger and turns on screen reader support.</w:t>
       </w:r>
     </w:p>
@@ -214,6 +256,7 @@
         </w:numPr>
       </w:pPr>
       <w:r>
+        <w:rPr/>
         <w:t>Download the agent kit from letitglow.app/ahg and unzip it. Open the folder in VS Code: File, then Open Folder.</w:t>
       </w:r>
     </w:p>
@@ -226,6 +269,7 @@
         </w:numPr>
       </w:pPr>
       <w:r>
+        <w:rPr/>
         <w:t>If a banner says Restricted Mode, choose Manage, then Trust. It is the workshop kit, and Copilot cannot work on its files until you trust it.</w:t>
       </w:r>
     </w:p>
@@ -238,6 +282,7 @@
         </w:numPr>
       </w:pPr>
       <w:r>
+        <w:rPr/>
         <w:t>Open Copilot Chat: Control+Alt+I on Windows, or Control+Command+I on a Mac. Type /ready-check and press Enter.</w:t>
       </w:r>
     </w:p>
@@ -250,7 +295,8 @@
         </w:numPr>
       </w:pPr>
       <w:r>
-        <w:t>Share your practice agent. Open letitglow.app/ahg/share in your browser, choose "My practice agent", choose the file my-agent/SKILL.md from the kit, and press "Open the share form on GitHub". On GitHub, tick the privacy box at the end of the form and press "Submit new issue".</w:t>
+        <w:rPr/>
+        <w:t>Share your practice agent. Open letitglow.app/ahg/share in your browser, choose "My practice agent", choose the file my-agent/SKILL.md from the kit, and press "Open the share form on GitHub". On GitHub, select the privacy check box at the end of the form and press "Submit new issue".</w:t>
       </w:r>
     </w:p>
     <w:p>
@@ -270,6 +316,7 @@
         </w:numPr>
       </w:pPr>
       <w:r>
+        <w:rPr/>
         <w:t>Download the agent kit from letitglow.app/ahg and unzip it. On Windows, open the zip and choose Extract all. On a Mac, open the zip.</w:t>
       </w:r>
     </w:p>
@@ -282,6 +329,7 @@
         </w:numPr>
       </w:pPr>
       <w:r>
+        <w:rPr/>
         <w:t>In Chrome or Edge, go to vscode.dev. Safari and Firefox cannot open a folder from your laptop.</w:t>
       </w:r>
     </w:p>
@@ -294,6 +342,7 @@
         </w:numPr>
       </w:pPr>
       <w:r>
+        <w:rPr/>
         <w:t>Choose Open Folder, and pick the ahg-2026-agent-kit folder. Your browser asks whether vscode.dev may see the files, and later whether it may save changes. Allow both.</w:t>
       </w:r>
     </w:p>
@@ -306,6 +355,7 @@
         </w:numPr>
       </w:pPr>
       <w:r>
+        <w:rPr/>
         <w:t>Open the Accounts menu, at the bottom of the bar on the left, and sign in with GitHub.</w:t>
       </w:r>
     </w:p>
@@ -318,6 +368,7 @@
         </w:numPr>
       </w:pPr>
       <w:r>
+        <w:rPr/>
         <w:t>Open Copilot Chat: Control+Alt+I on Windows, or Control+Command+I on a Mac. Type /ready-check and press Enter.</w:t>
       </w:r>
     </w:p>
@@ -330,6 +381,7 @@
         </w:numPr>
       </w:pPr>
       <w:r>
+        <w:rPr/>
         <w:t>Share your practice agent, as in step 7 of the VS Code steps above.</w:t>
       </w:r>
     </w:p>
@@ -343,6 +395,7 @@
     </w:p>
     <w:p>
       <w:r>
+        <w:rPr/>
         <w:t>Your assistant or Copilot ends the ready check with: You are ready for 16 November. And on GitHub, within about a minute, a reply begins: Well done.</w:t>
       </w:r>
     </w:p>
@@ -356,7 +409,21 @@
     </w:p>
     <w:p>
       <w:r>
-        <w:t>Write to support@community-access.org before the day, or come to the setup table outside the room from 10:00 on the day. Locked-down laptop, or VS Code blocked at work? Take the browser path; it needs nothing installed. GitHub blocked at work? Write to us; nobody is left out.</w:t>
+        <w:rPr/>
+        <w:t xml:space="preserve">Write to </w:t>
+      </w:r>
+      <w:hyperlink r:id="rId10">
+        <w:r>
+          <w:rPr>
+            <w:rStyle w:val="Hyperlink"/>
+            <w:u w:val="single"/>
+          </w:rPr>
+          <w:t xml:space="preserve">support@community-access.org</w:t>
+        </w:r>
+      </w:hyperlink>
+      <w:r>
+        <w:rPr/>
+        <w:t xml:space="preserve"> before the day, or come to the setup table outside the room from 10:00 on the day. Locked-down laptop, or VS Code blocked at work? Take the browser path; it needs nothing installed. GitHub blocked at work? Write to us; nobody is left out.</w:t>
       </w:r>
     </w:p>
     <w:p>
@@ -369,7 +436,61 @@
     </w:p>
     <w:p>
       <w:r>
+        <w:rPr/>
         <w:t>You are set up, and you have already shared an agent once. The hardest part of the day is done.</w:t>
+      </w:r>
+    </w:p>
+    <w:p>
+      <w:pPr>
+        <w:pStyle w:val="Heading2"/>
+      </w:pPr>
+      <w:r>
+        <w:t>Sources</w:t>
+      </w:r>
+    </w:p>
+    <w:p>
+      <w:r>
+        <w:rPr/>
+        <w:t xml:space="preserve">Checked on 29 October 2026: </w:t>
+      </w:r>
+      <w:hyperlink r:id="rId11">
+        <w:r>
+          <w:rPr>
+            <w:rStyle w:val="Hyperlink"/>
+            <w:u w:val="single"/>
+          </w:rPr>
+          <w:t xml:space="preserve">setting up Copilot in VS Code</w:t>
+        </w:r>
+      </w:hyperlink>
+      <w:r>
+        <w:rPr/>
+        <w:t xml:space="preserve"> (signing in turns on Copilot Free), </w:t>
+      </w:r>
+      <w:hyperlink r:id="rId12">
+        <w:r>
+          <w:rPr>
+            <w:rStyle w:val="Hyperlink"/>
+            <w:u w:val="single"/>
+          </w:rPr>
+          <w:t xml:space="preserve">profiles</w:t>
+        </w:r>
+      </w:hyperlink>
+      <w:r>
+        <w:rPr/>
+        <w:t xml:space="preserve"> (importing one) and </w:t>
+      </w:r>
+      <w:hyperlink r:id="rId13">
+        <w:r>
+          <w:rPr>
+            <w:rStyle w:val="Hyperlink"/>
+            <w:u w:val="single"/>
+          </w:rPr>
+          <w:t xml:space="preserve">VS Code for the Web</w:t>
+        </w:r>
+      </w:hyperlink>
+      <w:r>
+        <w:rPr/>
+        <w:t xml:space="preserve"> (opening a folder needs Chrome or Edge). The keys on every card are in the kit's README, with its sources.</w:t>
       </w:r>
     </w:p>
     <w:sectPr>

</xml_diff>

<commit_message>
Sync the kit from GLOW 8b5ad6c: four formats, sources, outcomes, tutorial (#5)
Copied by scripts/sync_ahg_repo.py from GLOW main at 8b5ad6c (PR #159):
Accessibility Agents vendored at 2f4fe22; every participant document in
Markdown, HTML, ACB large print Word and a reading deck; claims checked
against primary sources on 29 October 2026 with a Sources list on each
page; the learning outcomes read back in /my-30-day-plan and step card 7;
a glossary; a screen reader section in the README; the agent-writing
tutorial, write-your-own-agent.md. agents/ and practice/ are untouched.

Co-authored-by: Claude Opus 5.5 <noreply@anthropic.com>
</commit_message>
<xml_diff>
--- a/kit/step-cards/0-before-the-day.docx
+++ b/kit/step-cards/0-before-the-day.docx
@@ -12,6 +12,7 @@
     </w:p>
     <w:p>
       <w:r>
+        <w:rPr/>
         <w:t>About 10 to 25 minutes, any time before 16 November, depending on your path. Everything starts at letitglow.app/ahg.</w:t>
       </w:r>
     </w:p>
@@ -25,7 +26,22 @@
     </w:p>
     <w:p>
       <w:r>
+        <w:rPr/>
         <w:t>A laptop that is ready for the whole workshop, a message from your AI assistant saying so, and your practice agent already shared, so sharing on the day is the second time, not the first.</w:t>
+      </w:r>
+    </w:p>
+    <w:p>
+      <w:r>
+        <w:rPr/>
+        <w:t xml:space="preserve">New to words like agent, skill or Copilot Chat? Read </w:t>
+      </w:r>
+      <w:r>
+        <w:rPr/>
+        <w:t>glossary.md</w:t>
+      </w:r>
+      <w:r>
+        <w:rPr/>
+        <w:t xml:space="preserve"> in the kit, or at letitglow.app/ahg/kit, first. It is one page.</w:t>
       </w:r>
     </w:p>
     <w:p>
@@ -38,6 +54,7 @@
     </w:p>
     <w:p>
       <w:r>
+        <w:rPr/>
         <w:t>The day is the same on every path. Not sure? Take the browser path. letitglow.app/ahg/paths compares them.</w:t>
       </w:r>
     </w:p>
@@ -46,6 +63,7 @@
         <w:pStyle w:val="ListBullet"/>
       </w:pPr>
       <w:r>
+        <w:rPr/>
         <w:t>The browser path: nothing to install. ChatGPT, Copilot on github.com, Claude, Gemini or your campus assistant, in any browser.</w:t>
       </w:r>
     </w:p>
@@ -54,6 +72,7 @@
         <w:pStyle w:val="ListBullet"/>
       </w:pPr>
       <w:r>
+        <w:rPr/>
         <w:t>VS Code on your computer: install VS Code and type one Copilot command per block.</w:t>
       </w:r>
     </w:p>
@@ -62,6 +81,7 @@
         <w:pStyle w:val="ListBullet"/>
       </w:pPr>
       <w:r>
+        <w:rPr/>
         <w:t>VS Code for the Web: the same VS Code and Copilot at vscode.dev, in Chrome or Edge, with nothing to install.</w:t>
       </w:r>
     </w:p>
@@ -90,7 +110,21 @@
         </w:numPr>
       </w:pPr>
       <w:r>
+        <w:rPr/>
         <w:t>Make a free GitHub account at github.com, if you do not have one. Use your work email if your institution allows it. If GitHub asks you to set up two-factor sign-in, choose the option that works best with your screen reader or phone; GitHub Mobile and an authenticator app both work.</w:t>
+      </w:r>
+    </w:p>
+    <w:p>
+      <w:pPr>
+        <w:pStyle w:val="ListNumber"/>
+        <w:numPr>
+          <w:ilvl w:val="0"/>
+          <w:numId w:val="10"/>
+        </w:numPr>
+      </w:pPr>
+      <w:r>
+        <w:rPr/>
+        <w:t>Answer the five-minute survey at letitglow.app/ahg/survey: your name, email and GitHub username, your path, what your laptop and campus allow, and anything we should have ready for you.</w:t>
       </w:r>
     </w:p>
     <w:p>
@@ -110,6 +144,7 @@
         </w:numPr>
       </w:pPr>
       <w:r>
+        <w:rPr/>
         <w:t>Open your assistant in a new tab and sign in: chatgpt.com, github.com/copilot, claude.ai, gemini.google.com, or m365copilot.com with your work account. Sign in even if the assistant lets you start without it: ChatGPT stops after a message or two without an account.</w:t>
       </w:r>
     </w:p>
@@ -122,6 +157,7 @@
         </w:numPr>
       </w:pPr>
       <w:r>
+        <w:rPr/>
         <w:t>Optional, and a good habit: turn off training. In ChatGPT, open your profile menu, then Settings, then Data controls, and turn off "Improve the model for everyone". letitglow.app/ahg/paths has the steps for the others.</w:t>
       </w:r>
     </w:p>
@@ -134,6 +170,7 @@
         </w:numPr>
       </w:pPr>
       <w:r>
+        <w:rPr/>
         <w:t>In another tab, open letitglow.app/ahg/assistant. Under "Block 1: the ready check", press the Copy button. A message under the button says it is copied.</w:t>
       </w:r>
     </w:p>
@@ -146,6 +183,7 @@
         </w:numPr>
       </w:pPr>
       <w:r>
+        <w:rPr/>
         <w:t>Switch to your assistant's tab with Control+Tab. Move to the message box, paste with Control+V on Windows or Command+V on a Mac, and press Enter.</w:t>
       </w:r>
     </w:p>
@@ -158,7 +196,8 @@
         </w:numPr>
       </w:pPr>
       <w:r>
-        <w:t>Share your practice agent. Open letitglow.app/ahg/share, choose "My practice agent", press "Fill in the practice template", and press "Open the share form on GitHub". On GitHub, sign in if asked, tick the privacy box at the end of the form, and press "Submit new issue".</w:t>
+        <w:rPr/>
+        <w:t>Share your practice agent. Open letitglow.app/ahg/share, choose "My practice agent", press "Fill in the practice template", and press "Open the share form on GitHub". On GitHub, sign in if asked, select the privacy check box at the end of the form, and press "Submit new issue".</w:t>
       </w:r>
     </w:p>
     <w:p>
@@ -178,6 +217,7 @@
         </w:numPr>
       </w:pPr>
       <w:r>
+        <w:rPr/>
         <w:t>Install VS Code from code.visualstudio.com. On Windows it installs without administrator rights. You need version 1.143 or later.</w:t>
       </w:r>
     </w:p>
@@ -190,6 +230,7 @@
         </w:numPr>
       </w:pPr>
       <w:r>
+        <w:rPr/>
         <w:t>Open VS Code. Open the Accounts menu, at the bottom of the bar on the left, and sign in with GitHub. Copilot Free turns on by itself for an account with no Copilot plan.</w:t>
       </w:r>
     </w:p>
@@ -202,6 +243,7 @@
         </w:numPr>
       </w:pPr>
       <w:r>
+        <w:rPr/>
         <w:t>Import the AHG 2026 profile: open File, then Preferences, then Profiles. Open the menu on the New Profile button, choose Import Profile, paste the profile address from letitglow.app/ahg, and choose Create. It makes the text larger and turns on screen reader support.</w:t>
       </w:r>
     </w:p>
@@ -214,6 +256,7 @@
         </w:numPr>
       </w:pPr>
       <w:r>
+        <w:rPr/>
         <w:t>Download the agent kit from letitglow.app/ahg and unzip it. Open the folder in VS Code: File, then Open Folder.</w:t>
       </w:r>
     </w:p>
@@ -226,6 +269,7 @@
         </w:numPr>
       </w:pPr>
       <w:r>
+        <w:rPr/>
         <w:t>If a banner says Restricted Mode, choose Manage, then Trust. It is the workshop kit, and Copilot cannot work on its files until you trust it.</w:t>
       </w:r>
     </w:p>
@@ -238,6 +282,7 @@
         </w:numPr>
       </w:pPr>
       <w:r>
+        <w:rPr/>
         <w:t>Open Copilot Chat: Control+Alt+I on Windows, or Control+Command+I on a Mac. Type /ready-check and press Enter.</w:t>
       </w:r>
     </w:p>
@@ -250,7 +295,8 @@
         </w:numPr>
       </w:pPr>
       <w:r>
-        <w:t>Share your practice agent. Open letitglow.app/ahg/share in your browser, choose "My practice agent", choose the file my-agent/SKILL.md from the kit, and press "Open the share form on GitHub". On GitHub, tick the privacy box at the end of the form and press "Submit new issue".</w:t>
+        <w:rPr/>
+        <w:t>Share your practice agent. Open letitglow.app/ahg/share in your browser, choose "My practice agent", choose the file my-agent/SKILL.md from the kit, and press "Open the share form on GitHub". On GitHub, select the privacy check box at the end of the form and press "Submit new issue".</w:t>
       </w:r>
     </w:p>
     <w:p>
@@ -270,6 +316,7 @@
         </w:numPr>
       </w:pPr>
       <w:r>
+        <w:rPr/>
         <w:t>Download the agent kit from letitglow.app/ahg and unzip it. On Windows, open the zip and choose Extract all. On a Mac, open the zip.</w:t>
       </w:r>
     </w:p>
@@ -282,6 +329,7 @@
         </w:numPr>
       </w:pPr>
       <w:r>
+        <w:rPr/>
         <w:t>In Chrome or Edge, go to vscode.dev. Safari and Firefox cannot open a folder from your laptop.</w:t>
       </w:r>
     </w:p>
@@ -294,6 +342,7 @@
         </w:numPr>
       </w:pPr>
       <w:r>
+        <w:rPr/>
         <w:t>Choose Open Folder, and pick the ahg-2026-agent-kit folder. Your browser asks whether vscode.dev may see the files, and later whether it may save changes. Allow both.</w:t>
       </w:r>
     </w:p>
@@ -306,6 +355,7 @@
         </w:numPr>
       </w:pPr>
       <w:r>
+        <w:rPr/>
         <w:t>Open the Accounts menu, at the bottom of the bar on the left, and sign in with GitHub.</w:t>
       </w:r>
     </w:p>
@@ -318,6 +368,7 @@
         </w:numPr>
       </w:pPr>
       <w:r>
+        <w:rPr/>
         <w:t>Open Copilot Chat: Control+Alt+I on Windows, or Control+Command+I on a Mac. Type /ready-check and press Enter.</w:t>
       </w:r>
     </w:p>
@@ -330,6 +381,7 @@
         </w:numPr>
       </w:pPr>
       <w:r>
+        <w:rPr/>
         <w:t>Share your practice agent, as in step 7 of the VS Code steps above.</w:t>
       </w:r>
     </w:p>
@@ -343,6 +395,7 @@
     </w:p>
     <w:p>
       <w:r>
+        <w:rPr/>
         <w:t>Your assistant or Copilot ends the ready check with: You are ready for 16 November. And on GitHub, within about a minute, a reply begins: Well done.</w:t>
       </w:r>
     </w:p>
@@ -356,7 +409,21 @@
     </w:p>
     <w:p>
       <w:r>
-        <w:t>Write to support@community-access.org before the day, or come to the setup table outside the room from 10:00 on the day. Locked-down laptop, or VS Code blocked at work? Take the browser path; it needs nothing installed. GitHub blocked at work? Write to us; nobody is left out.</w:t>
+        <w:rPr/>
+        <w:t xml:space="preserve">Write to </w:t>
+      </w:r>
+      <w:hyperlink r:id="rId10">
+        <w:r>
+          <w:rPr>
+            <w:rStyle w:val="Hyperlink"/>
+            <w:u w:val="single"/>
+          </w:rPr>
+          <w:t xml:space="preserve">support@community-access.org</w:t>
+        </w:r>
+      </w:hyperlink>
+      <w:r>
+        <w:rPr/>
+        <w:t xml:space="preserve"> before the day, or come to the setup table outside the room from 10:00 on the day. Locked-down laptop, or VS Code blocked at work? Take the browser path; it needs nothing installed. GitHub blocked at work? Write to us; nobody is left out.</w:t>
       </w:r>
     </w:p>
     <w:p>
@@ -369,7 +436,61 @@
     </w:p>
     <w:p>
       <w:r>
+        <w:rPr/>
         <w:t>You are set up, and you have already shared an agent once. The hardest part of the day is done.</w:t>
+      </w:r>
+    </w:p>
+    <w:p>
+      <w:pPr>
+        <w:pStyle w:val="Heading2"/>
+      </w:pPr>
+      <w:r>
+        <w:t>Sources</w:t>
+      </w:r>
+    </w:p>
+    <w:p>
+      <w:r>
+        <w:rPr/>
+        <w:t xml:space="preserve">Checked on 29 October 2026: </w:t>
+      </w:r>
+      <w:hyperlink r:id="rId11">
+        <w:r>
+          <w:rPr>
+            <w:rStyle w:val="Hyperlink"/>
+            <w:u w:val="single"/>
+          </w:rPr>
+          <w:t xml:space="preserve">setting up Copilot in VS Code</w:t>
+        </w:r>
+      </w:hyperlink>
+      <w:r>
+        <w:rPr/>
+        <w:t xml:space="preserve"> (signing in turns on Copilot Free), </w:t>
+      </w:r>
+      <w:hyperlink r:id="rId12">
+        <w:r>
+          <w:rPr>
+            <w:rStyle w:val="Hyperlink"/>
+            <w:u w:val="single"/>
+          </w:rPr>
+          <w:t xml:space="preserve">profiles</w:t>
+        </w:r>
+      </w:hyperlink>
+      <w:r>
+        <w:rPr/>
+        <w:t xml:space="preserve"> (importing one) and </w:t>
+      </w:r>
+      <w:hyperlink r:id="rId13">
+        <w:r>
+          <w:rPr>
+            <w:rStyle w:val="Hyperlink"/>
+            <w:u w:val="single"/>
+          </w:rPr>
+          <w:t xml:space="preserve">VS Code for the Web</w:t>
+        </w:r>
+      </w:hyperlink>
+      <w:r>
+        <w:rPr/>
+        <w:t xml:space="preserve"> (opening a folder needs Chrome or Edge). The keys on every card are in the kit's README, with its sources.</w:t>
       </w:r>
     </w:p>
     <w:sectPr>

</xml_diff>